<commit_message>
chore(templates): update PGD template for To Trinh
</commit_message>
<xml_diff>
--- a/webapp/templates/TOTRINH/02_Mau_To_trinh_PGD.docx
+++ b/webapp/templates/TOTRINH/02_Mau_To_trinh_PGD.docx
@@ -212,8 +212,8 @@
                     </w:rPr>
                     <w:t xml:space="preserve">CỘNG HOÀ XÃ HỘI CHỦ NGHĨA VIỆT </w:t>
                   </w:r>
-                  <w:smartTag w:uri="urn:schemas-microsoft-com:office:smarttags" w:element="country-region">
-                    <w:smartTag w:uri="urn:schemas-microsoft-com:office:smarttags" w:element="place">
+                  <w:smartTag w:uri="urn:schemas-microsoft-com:office:smarttags" w:element="place">
+                    <w:smartTag w:uri="urn:schemas-microsoft-com:office:smarttags" w:element="country-region">
                       <w:r>
                         <w:rPr>
                           <w:rFonts w:ascii="Times New Roman" w:hAnsi="Times New Roman"/>
@@ -312,18 +312,8 @@
                       <w:b/>
                       <w:szCs w:val="28"/>
                     </w:rPr>
-                    <w:t xml:space="preserve"> </w:t>
-                  </w:r>
-                  <w:proofErr w:type="spellStart"/>
-                  <w:r>
-                    <w:rPr>
-                      <w:rFonts w:ascii="Times New Roman" w:hAnsi="Times New Roman"/>
-                      <w:b/>
-                      <w:szCs w:val="28"/>
-                    </w:rPr>
-                    <w:t>phúc</w:t>
-                  </w:r>
-                  <w:proofErr w:type="spellEnd"/>
+                    <w:t xml:space="preserve"> phúc</w:t>
+                  </w:r>
                 </w:p>
                 <w:p>
                   <w:pPr>
@@ -1439,7 +1429,9 @@
                       <w:rFonts w:ascii="Times New Roman" w:hAnsi="Times New Roman"/>
                       <w:b/>
                       <w:bCs/>
-                      <w:szCs w:val="28"/>
+                      <w:spacing w:val="-6"/>
+                      <w:szCs w:val="28"/>
+                      <w:lang w:val="vi-VN"/>
                     </w:rPr>
                   </w:pPr>
                   <w:r>
@@ -1449,8 +1441,44 @@
                       <w:bCs/>
                       <w:spacing w:val="-6"/>
                       <w:szCs w:val="28"/>
+                      <w:lang w:val="vi-VN"/>
+                    </w:rPr>
+                    <w:t>KT.</w:t>
+                  </w:r>
+                  <w:r>
+                    <w:rPr>
+                      <w:rFonts w:ascii="Times New Roman" w:hAnsi="Times New Roman"/>
+                      <w:b/>
+                      <w:bCs/>
+                      <w:spacing w:val="-6"/>
+                      <w:szCs w:val="28"/>
                     </w:rPr>
                     <w:t xml:space="preserve">GIÁM ĐỐC </w:t>
+                  </w:r>
+                </w:p>
+                <w:p>
+                  <w:pPr>
+                    <w:ind w:right="-1"/>
+                    <w:jc w:val="center"/>
+                    <w:rPr>
+                      <w:rFonts w:ascii="Times New Roman" w:hAnsi="Times New Roman"/>
+                      <w:b/>
+                      <w:bCs/>
+                      <w:spacing w:val="-6"/>
+                      <w:szCs w:val="28"/>
+                      <w:lang w:val="vi-VN"/>
+                    </w:rPr>
+                  </w:pPr>
+                  <w:r>
+                    <w:rPr>
+                      <w:rFonts w:ascii="Times New Roman" w:hAnsi="Times New Roman"/>
+                      <w:b/>
+                      <w:bCs/>
+                      <w:spacing w:val="-6"/>
+                      <w:szCs w:val="28"/>
+                      <w:lang w:val="vi-VN"/>
+                    </w:rPr>
+                    <w:t xml:space="preserve">PHÓ GIÁM ĐỐC </w:t>
                   </w:r>
                 </w:p>
                 <w:p>
@@ -1581,33 +1609,8 @@
                       <w:rFonts w:ascii="Times New Roman" w:hAnsi="Times New Roman"/>
                       <w:b/>
                     </w:rPr>
-                    <w:t xml:space="preserve"> </w:t>
-                  </w:r>
-                  <w:proofErr w:type="spellStart"/>
-                  <w:r>
-                    <w:rPr>
-                      <w:rFonts w:ascii="Times New Roman" w:hAnsi="Times New Roman"/>
-                      <w:b/>
-                    </w:rPr>
-                    <w:t>Và</w:t>
-                  </w:r>
-                  <w:proofErr w:type="spellEnd"/>
-                  <w:r>
-                    <w:rPr>
-                      <w:rFonts w:ascii="Times New Roman" w:hAnsi="Times New Roman"/>
-                      <w:b/>
-                    </w:rPr>
-                    <w:t xml:space="preserve"> </w:t>
-                  </w:r>
-                  <w:proofErr w:type="spellStart"/>
-                  <w:r>
-                    <w:rPr>
-                      <w:rFonts w:ascii="Times New Roman" w:hAnsi="Times New Roman"/>
-                      <w:b/>
-                    </w:rPr>
-                    <w:t>Tên</w:t>
-                  </w:r>
-                  <w:proofErr w:type="spellEnd"/>
+                    <w:t xml:space="preserve"> Và Tên</w:t>
+                  </w:r>
                   <w:r>
                     <w:rPr>
                       <w:rFonts w:ascii="Times New Roman" w:hAnsi="Times New Roman"/>

</xml_diff>